<commit_message>
Upgrade ABC food pages, BRS3 ADHD evidence, and canonical reference tooling.
Bring Day-1 food pages to canonical reference format with body citations and audit scripts; add Pycnogenol pediatric ADHD trial cluster to BRS3 FM2-PM4 and hub dropdown; extend mechanism translational content and bibliography entries.

Co-authored-by: Cursor <cursoragent@cursor.com>
</commit_message>
<xml_diff>
--- a/manuscript/BRS1-ADHD-structure-and-evidence-summary.docx
+++ b/manuscript/BRS1-ADHD-structure-and-evidence-summary.docx
@@ -503,6 +503,337 @@
         <w:t>Vance, D. E. (2014). Physiological roles of phosphatidylethanolamine N-methyltransferase. Biochimica et Biophysica Acta, 1831(3), 626–632. https://doi.org/10.1016/j.bbalip.2012.07.018</w:t>
       </w:r>
     </w:p>
+    <w:p>
+      <w:r>
+        <w:br w:type="page"/>
+      </w:r>
+    </w:p>
+    <w:p>
+      <w:pPr>
+        <w:pStyle w:val="Heading1"/>
+      </w:pPr>
+      <w:r>
+        <w:rPr>
+          <w:sz w:val="28"/>
+        </w:rPr>
+        <w:t>BRS3 — Inflammation &amp; Oxidative Stress: Framework Structure and ADHD-Relevant Evidence</w:t>
+      </w:r>
+    </w:p>
+    <w:p>
+      <w:pPr>
+        <w:spacing w:line="480" w:lineRule="auto" w:after="120"/>
+      </w:pPr>
+      <w:r>
+        <w:rPr>
+          <w:rFonts w:ascii="Times New Roman" w:hAnsi="Times New Roman"/>
+          <w:sz w:val="24"/>
+        </w:rPr>
+        <w:t>Within the BRAIN Framework, BRS3 (Inflammation &amp; Oxidative Stress) describes the immune and redox regulation layer linking dietary pattern, gut–immune context, and antioxidant biology to inflammatory signalling and oxidative burden. Three Functional Mechanisms integrate eight Primary Mechanisms: BRS3(FM1) Anti-Inflammatory Signalling Tone (PM1–PM2: NF-κB regulation, gut-derived inflammatory signalling); BRS3(FM2) Antioxidant Defense Capacity (PM3–PM6: Nrf2-ARE antioxidant activation, ROS generation versus clearance balance, lipid peroxidation control, antioxidant network recycling); and BRS3(FM3) Inflammation Resolution Capacity (PM7–PM8: cytokine network modulation, eicosanoid/SPM balance). Key Constraints govern shared antioxidant substrate and essential fatty-acid pools that constrain multiple PMs simultaneously.</w:t>
+      </w:r>
+    </w:p>
+    <w:p>
+      <w:pPr>
+        <w:spacing w:line="480" w:lineRule="auto" w:after="120"/>
+      </w:pPr>
+      <w:r>
+        <w:rPr>
+          <w:rFonts w:ascii="Times New Roman" w:hAnsi="Times New Roman"/>
+          <w:sz w:val="24"/>
+        </w:rPr>
+        <w:t>In ADHD, inflammatory and redox biology intersect across these capacities rather than through a single biomarker. Systemic inflammation relates to default-mode network connectivity (Marsland et al., 2017); metabolic and postprandial inflammatory patterns are reported (Brown et al., 2025); and elevated pro-inflammatory cytokine context is described in paediatric cohorts (Chang et al., 2020). Gut-derived load includes reduced microbiome alpha diversity (Prehn-Kristensen et al., 2018), butyrate-linked neuroinflammation framing (Yunting Li et al., 2024), and propionate–norepinephrine signalling with possible attention relevance (Hoyles et al., 2018). Immune–allergy overlap is also reported (Wesselink et al., 2019). On the redox side, adult ADHD cohorts show elevated malondialdehyde (Bulut et al., 2007), thiol/disulfide shifts and DNA oxidation markers (Kurhan &amp; Alp, 2021), elevated oxidative-stress indices (Miniksar et al., 2023), and compensatory glutathione elevation (Verlaet et al., 2019). Dietary antioxidant treatment rationale, ultra-processed food and metals exposure, and emerging contaminant burden are reviewed in ADHD nutritional contexts (Verlaet et al., 2018; Dufault et al., 2024; Zhang et al., 2025).</w:t>
+      </w:r>
+    </w:p>
+    <w:p>
+      <w:pPr>
+        <w:spacing w:line="480" w:lineRule="auto" w:after="120"/>
+      </w:pPr>
+      <w:r>
+        <w:rPr>
+          <w:rFonts w:ascii="Times New Roman" w:hAnsi="Times New Roman"/>
+          <w:sz w:val="24"/>
+        </w:rPr>
+        <w:t>Collectively, these findings support the BRAIN Framework proposition that ADHD-relevant biology in BRS3 emerges from interacting constraints on inflammatory tone, endogenous antioxidant induction, net redox balance, and inflammation-resolution substrate context — providing multiple diet-actionable entry points beyond isolated anti-inflammatory or antioxidant supplementation models.</w:t>
+      </w:r>
+    </w:p>
+    <w:p>
+      <w:pPr>
+        <w:pStyle w:val="Heading2"/>
+      </w:pPr>
+      <w:r>
+        <w:rPr>
+          <w:sz w:val="26"/>
+        </w:rPr>
+        <w:t>Paper review: Verlaet et al. (2018) and BRS3-FM2-PM3 (Nrf2-ARE Antioxidant Activation)</w:t>
+      </w:r>
+    </w:p>
+    <w:p>
+      <w:pPr>
+        <w:spacing w:line="480" w:lineRule="auto" w:after="120"/>
+      </w:pPr>
+      <w:r>
+        <w:rPr>
+          <w:rFonts w:ascii="Times New Roman" w:hAnsi="Times New Roman"/>
+          <w:sz w:val="24"/>
+        </w:rPr>
+        <w:t>Verlaet et al. (2018) is a narrative review in Nutrients that argues for dietary antioxidant strategies as a complementary frame in ADHD, set against growing concern about limitations and side effects of stimulant pharmacotherapy alone. The authors synthesise evidence that ADHD is associated with immune dysregulation, epigenetic modulation of gene expression, and altered oxidant–antioxidant balance. Their central mechanistic claim is that chronic low-grade inflammation and oxidative stress can reinforce one another — through pathways such as T-cell-mediated neuroinflammation and neuronal oxidative injury — and that nutritional modulation of immune activity and redox state may therefore be biologically plausible in ADHD management. The review emphasises food-derived polyphenols and broader natural antioxidant strategies rather than high-dose isolated supplement megadosing.</w:t>
+      </w:r>
+    </w:p>
+    <w:p>
+      <w:pPr>
+        <w:spacing w:line="480" w:lineRule="auto" w:after="120"/>
+      </w:pPr>
+      <w:r>
+        <w:rPr>
+          <w:rFonts w:ascii="Times New Roman" w:hAnsi="Times New Roman"/>
+          <w:sz w:val="24"/>
+        </w:rPr>
+        <w:t>Within the BRAIN Framework, this paper is most directly anchored to BRS3-FM2-PM3 (Nrf2-ARE Antioxidant Activation), the PM governing endogenous antioxidant and detoxification gene programmes rather than passive dietary antioxidant intake alone. Verlaet et al. do not name Nrf2 explicitly, but their argument aligns with PM3 logic: raising cellular defence capacity through repeatable dietary induction patterns (for example crucifer-derived isothiocyanates such as sulforaphane) supported by trace-mineral cofactor sufficiency (selenium, zinc, manganese) within BRS3(KC1) Antioxidant Substrate Availability. Mechanistic support for Nrf2-linked induction in human dietary contexts is provided separately by Houghton et al. (2016), which PM3 cites for bioavailability and repeated-exposure kinetics; Mocchegiani &amp; Malavolta (2019) further supports cofactor dependence of endogenous antioxidant enzyme systems.</w:t>
+      </w:r>
+    </w:p>
+    <w:p>
+      <w:pPr>
+        <w:spacing w:line="480" w:lineRule="auto" w:after="120"/>
+      </w:pPr>
+      <w:r>
+        <w:rPr>
+          <w:rFonts w:ascii="Times New Roman" w:hAnsi="Times New Roman"/>
+          <w:sz w:val="24"/>
+        </w:rPr>
+        <w:t>For phenome interpretation, Verlaet et al. (2018) is used cautiously at low–medium confidence for Cognitive Clarity and Focus / Attention Stability on PM3 — as translational context linking oxidative-stress and immune readout shifts to attention-relevant biology, not as proof of dietary treatment efficacy. The paper is hypothesis-generating and integrative rather than an intervention outcome trial; findings should be read alongside sibling PMs handling net ROS balance (PM4), membrane lipid damage (PM5), and antioxidant network recycling (PM6). Its value for the manuscript is in justifying why BRS3(FM2) treats endogenous antioxidant activation as a first-class, diet-actionable mechanism in ADHD nutritional framing.</w:t>
+      </w:r>
+    </w:p>
+    <w:p>
+      <w:pPr>
+        <w:pStyle w:val="Heading2"/>
+      </w:pPr>
+      <w:r>
+        <w:t>References</w:t>
+      </w:r>
+    </w:p>
+    <w:p>
+      <w:pPr>
+        <w:pStyle w:val="ListNumber"/>
+        <w:spacing w:line="240" w:lineRule="auto" w:after="60"/>
+        <w:ind w:left="360" w:hanging="360"/>
+      </w:pPr>
+      <w:r>
+        <w:rPr>
+          <w:rFonts w:ascii="Times New Roman" w:hAnsi="Times New Roman"/>
+          <w:sz w:val="22"/>
+        </w:rPr>
+        <w:t>Brown et al. (2025). Associations between ADHD and metabolic disorders. See BRAIN Diet bibliography: brown_associations_2025.</w:t>
+      </w:r>
+    </w:p>
+    <w:p>
+      <w:pPr>
+        <w:pStyle w:val="ListNumber"/>
+        <w:spacing w:line="240" w:lineRule="auto" w:after="60"/>
+        <w:ind w:left="360" w:hanging="360"/>
+      </w:pPr>
+      <w:r>
+        <w:rPr>
+          <w:rFonts w:ascii="Times New Roman" w:hAnsi="Times New Roman"/>
+          <w:sz w:val="22"/>
+        </w:rPr>
+        <w:t>Bulut, M., et al. (2007). Evaluation of malondialdehyde levels in adult attention deficit hyperactivity disorder. Psychiatry and Clinical Psychopharmacology. https://doi.org/10.1080/14751740701595421</w:t>
+      </w:r>
+    </w:p>
+    <w:p>
+      <w:pPr>
+        <w:pStyle w:val="ListNumber"/>
+        <w:spacing w:line="240" w:lineRule="auto" w:after="60"/>
+        <w:ind w:left="360" w:hanging="360"/>
+      </w:pPr>
+      <w:r>
+        <w:rPr>
+          <w:rFonts w:ascii="Times New Roman" w:hAnsi="Times New Roman"/>
+          <w:sz w:val="22"/>
+        </w:rPr>
+        <w:t>Chang, J. P.-C., et al. (2020). Cortisol, inflammatory biomarkers and neurotrophins in children and adolescents with ADHD in Taiwan. Brain, Behavior, and Immunity, 88. https://doi.org/10.1016/j.bbi.2020.05.017</w:t>
+      </w:r>
+    </w:p>
+    <w:p>
+      <w:pPr>
+        <w:pStyle w:val="ListNumber"/>
+        <w:spacing w:line="240" w:lineRule="auto" w:after="60"/>
+        <w:ind w:left="360" w:hanging="360"/>
+      </w:pPr>
+      <w:r>
+        <w:rPr>
+          <w:rFonts w:ascii="Times New Roman" w:hAnsi="Times New Roman"/>
+          <w:sz w:val="22"/>
+        </w:rPr>
+        <w:t>Dufault, R., et al. (2024). Nutritional factors in ADHD and related disorders. See BRAIN Diet bibliography: dufault_nutritional_2024.</w:t>
+      </w:r>
+    </w:p>
+    <w:p>
+      <w:pPr>
+        <w:pStyle w:val="ListNumber"/>
+        <w:spacing w:line="240" w:lineRule="auto" w:after="60"/>
+        <w:ind w:left="360" w:hanging="360"/>
+      </w:pPr>
+      <w:r>
+        <w:rPr>
+          <w:rFonts w:ascii="Times New Roman" w:hAnsi="Times New Roman"/>
+          <w:sz w:val="22"/>
+        </w:rPr>
+        <w:t>Houghton, C. A., Fassett, R. G., &amp; Coombes, J. S. (2016). Can the clinician's expectation be matched by the reality? Sulforaphane bioavailability and Nrf2 activation. Oxidative Medicine and Cellular Longevity. https://doi.org/10.1155/2016/7857186</w:t>
+      </w:r>
+    </w:p>
+    <w:p>
+      <w:pPr>
+        <w:pStyle w:val="ListNumber"/>
+        <w:spacing w:line="240" w:lineRule="auto" w:after="60"/>
+        <w:ind w:left="360" w:hanging="360"/>
+      </w:pPr>
+      <w:r>
+        <w:rPr>
+          <w:rFonts w:ascii="Times New Roman" w:hAnsi="Times New Roman"/>
+          <w:sz w:val="22"/>
+        </w:rPr>
+        <w:t>Hoyles, T., et al. (2018). Microbiome-host systems biology. See BRAIN Diet bibliography: hoyles_microbiome-host_2018.</w:t>
+      </w:r>
+    </w:p>
+    <w:p>
+      <w:pPr>
+        <w:pStyle w:val="ListNumber"/>
+        <w:spacing w:line="240" w:lineRule="auto" w:after="60"/>
+        <w:ind w:left="360" w:hanging="360"/>
+      </w:pPr>
+      <w:r>
+        <w:rPr>
+          <w:rFonts w:ascii="Times New Roman" w:hAnsi="Times New Roman"/>
+          <w:sz w:val="22"/>
+        </w:rPr>
+        <w:t>Kurhan, S., &amp; Alp, H. H. (2021). Dynamic thiol/disulfide homeostasis in ADHD. Psychiatry Investigation. https://doi.org/10.30773/pi.2020.0359</w:t>
+      </w:r>
+    </w:p>
+    <w:p>
+      <w:pPr>
+        <w:pStyle w:val="ListNumber"/>
+        <w:spacing w:line="240" w:lineRule="auto" w:after="60"/>
+        <w:ind w:left="360" w:hanging="360"/>
+      </w:pPr>
+      <w:r>
+        <w:rPr>
+          <w:rFonts w:ascii="Times New Roman" w:hAnsi="Times New Roman"/>
+          <w:sz w:val="22"/>
+        </w:rPr>
+        <w:t>Marsland, A. L., et al. (2017). Systemic inflammation and brain structure in healthy and depressed individuals. See BRAIN Diet bibliography: marsland_systemic_2017.</w:t>
+      </w:r>
+    </w:p>
+    <w:p>
+      <w:pPr>
+        <w:pStyle w:val="ListNumber"/>
+        <w:spacing w:line="240" w:lineRule="auto" w:after="60"/>
+        <w:ind w:left="360" w:hanging="360"/>
+      </w:pPr>
+      <w:r>
+        <w:rPr>
+          <w:rFonts w:ascii="Times New Roman" w:hAnsi="Times New Roman"/>
+          <w:sz w:val="22"/>
+        </w:rPr>
+        <w:t>Miniksar, D. B., et al. (2023). The effect of drug use, BMI and blood pressure on oxidative stress levels in children and adolescents with ADHD. Clinical Psychopharmacology and Neuroscience, 21(1). https://doi.org/10.9758/cpn.2023.21.1.88</w:t>
+      </w:r>
+    </w:p>
+    <w:p>
+      <w:pPr>
+        <w:pStyle w:val="ListNumber"/>
+        <w:spacing w:line="240" w:lineRule="auto" w:after="60"/>
+        <w:ind w:left="360" w:hanging="360"/>
+      </w:pPr>
+      <w:r>
+        <w:rPr>
+          <w:rFonts w:ascii="Times New Roman" w:hAnsi="Times New Roman"/>
+          <w:sz w:val="22"/>
+        </w:rPr>
+        <w:t>Mocchegiani, E., &amp; Malavolta, M. (2019). Role of zinc and selenium in antioxidant systems. See BRAIN Diet bibliography: mocchegiani_role_2019.</w:t>
+      </w:r>
+    </w:p>
+    <w:p>
+      <w:pPr>
+        <w:pStyle w:val="ListNumber"/>
+        <w:spacing w:line="240" w:lineRule="auto" w:after="60"/>
+        <w:ind w:left="360" w:hanging="360"/>
+      </w:pPr>
+      <w:r>
+        <w:rPr>
+          <w:rFonts w:ascii="Times New Roman" w:hAnsi="Times New Roman"/>
+          <w:sz w:val="22"/>
+        </w:rPr>
+        <w:t>Prehn-Kristensen, A., et al. (2018). Reduced microbiome alpha diversity in ADHD. See BRAIN Diet bibliography: prehn-kristensen_reduced_2018.</w:t>
+      </w:r>
+    </w:p>
+    <w:p>
+      <w:pPr>
+        <w:pStyle w:val="ListNumber"/>
+        <w:spacing w:line="240" w:lineRule="auto" w:after="60"/>
+        <w:ind w:left="360" w:hanging="360"/>
+      </w:pPr>
+      <w:r>
+        <w:rPr>
+          <w:rFonts w:ascii="Times New Roman" w:hAnsi="Times New Roman"/>
+          <w:sz w:val="22"/>
+        </w:rPr>
+        <w:t>Verlaet, A., Maasakkers, C., Hermans, N., &amp; Savelkoul, H. (2018). Rationale for dietary antioxidant treatment of ADHD. Nutrients, 10(4), 405. https://doi.org/10.3390/nu10040405</w:t>
+      </w:r>
+    </w:p>
+    <w:p>
+      <w:pPr>
+        <w:pStyle w:val="ListNumber"/>
+        <w:spacing w:line="240" w:lineRule="auto" w:after="60"/>
+        <w:ind w:left="360" w:hanging="360"/>
+      </w:pPr>
+      <w:r>
+        <w:rPr>
+          <w:rFonts w:ascii="Times New Roman" w:hAnsi="Times New Roman"/>
+          <w:sz w:val="22"/>
+        </w:rPr>
+        <w:t>Verlaet, A., et al. (2019). Oxidative stress in ADHD. See BRAIN Diet bibliography: verlaet_oxidative_2019.</w:t>
+      </w:r>
+    </w:p>
+    <w:p>
+      <w:pPr>
+        <w:pStyle w:val="ListNumber"/>
+        <w:spacing w:line="240" w:lineRule="auto" w:after="60"/>
+        <w:ind w:left="360" w:hanging="360"/>
+      </w:pPr>
+      <w:r>
+        <w:rPr>
+          <w:rFonts w:ascii="Times New Roman" w:hAnsi="Times New Roman"/>
+          <w:sz w:val="22"/>
+        </w:rPr>
+        <w:t>Wesselink, E., et al. (2019). Feeding, immunity, and ADHD. See BRAIN Diet bibliography: wesselink_feeding_2019.</w:t>
+      </w:r>
+    </w:p>
+    <w:p>
+      <w:pPr>
+        <w:pStyle w:val="ListNumber"/>
+        <w:spacing w:line="240" w:lineRule="auto" w:after="60"/>
+        <w:ind w:left="360" w:hanging="360"/>
+      </w:pPr>
+      <w:r>
+        <w:rPr>
+          <w:rFonts w:ascii="Times New Roman" w:hAnsi="Times New Roman"/>
+          <w:sz w:val="22"/>
+        </w:rPr>
+        <w:t>Yunting Li, et al. (2024). Sodium butyrate and neuroinflammation. See BRAIN Diet bibliography: li_sodium_2024.</w:t>
+      </w:r>
+    </w:p>
+    <w:p>
+      <w:pPr>
+        <w:pStyle w:val="ListNumber"/>
+        <w:spacing w:line="240" w:lineRule="auto" w:after="60"/>
+        <w:ind w:left="360" w:hanging="360"/>
+      </w:pPr>
+      <w:r>
+        <w:rPr>
+          <w:rFonts w:ascii="Times New Roman" w:hAnsi="Times New Roman"/>
+          <w:sz w:val="22"/>
+        </w:rPr>
+        <w:t>Zhang, Y., et al. (2025). Micro/nanoplastics and ADHD. See BRAIN Diet bibliography: zhang_exploring_2025.</w:t>
+      </w:r>
+    </w:p>
     <w:sectPr>
       <w:pgSz w:w="12240" w:h="15840"/>
       <w:pgMar w:top="1440" w:right="1440" w:bottom="1440" w:left="1440" w:header="720" w:footer="720" w:gutter="0"/>

</xml_diff>

<commit_message>
Refine BRS hub strategy sections, Target Foods, and Greek yogurt page.
Move hub Dietary Strategy and Lifestyle Priorities under Ambition, add curated Target Foods captions for all BRS hubs, expand Berries to linked examples, rename yogurt to Greek yogurt with redirect, and refresh hub lever generation and related content.

Co-authored-by: Cursor <cursoragent@cursor.com>
</commit_message>
<xml_diff>
--- a/manuscript/BRS1-ADHD-structure-and-evidence-summary.docx
+++ b/manuscript/BRS1-ADHD-structure-and-evidence-summary.docx
@@ -30,7 +30,7 @@
           <w:rFonts w:ascii="Times New Roman" w:hAnsi="Times New Roman"/>
           <w:sz w:val="24"/>
         </w:rPr>
-        <w:t>Within the BRAIN Framework, BRS1 (Neurotransmitter Regulation) describes the signal layer supporting attention, motivation, mood, and behavioural control. Four Functional Mechanisms (FMs) integrate diet-actionable Primary Mechanisms (PMs): BRS1(FM1) Monoaminergic Function (PM1–PM4: amino-acid availability, LAT1 transport, noradrenergic executive modulation, serotonergic regulation); BRS1(FM2) Cholinergic Function (PM5: acetylcholine synthesis); BRS1(FM3) Membrane Lipid Integrity (PM6: neuronal DHA incorporation); and BRS1(FM4) Excitatory–Inhibitory Balance (PM7–PM10: GABA–glutamate balance, GABA synthesis, glutamate clearance, excitotoxicity modulation). Key Constraints (shared substrate pools) and Specific Mechanisms (phenotype, genetic, and cross-system interpretation layers) provide additional structural context.</w:t>
+        <w:t>Within the BRAIN Framework, BRS1 (Neurotransmitter Regulation) describes the signal layer supporting attention, motivation, mood, and behavioural control. Four Functional Mechanisms (FMs) integrate diet-actionable Primary Mechanisms (PMs): BRS1(FM1) Monoaminergic Function (PM1–PM4: amino-acid availability, LAT1 transport, noradrenergic executive modulation, serotonergic regulation); BRS1(FM2) Cholinergic Function (PM5: acetylcholine synthesis); BRS1(FM3) Membrane Lipid Integrity (PM6: neuronal DHA incorporation); and BRS1(FM4) GABA–Glutamate Regulation (PM7–PM10: GABA–glutamate balance, GABA synthesis, glutamate clearance, excitotoxicity modulation). Key Constraints (shared substrate pools) and Specific Mechanisms (phenotype, genetic, and cross-system interpretation layers) provide additional structural context.</w:t>
       </w:r>
     </w:p>
     <w:p>
@@ -528,7 +528,7 @@
           <w:rFonts w:ascii="Times New Roman" w:hAnsi="Times New Roman"/>
           <w:sz w:val="24"/>
         </w:rPr>
-        <w:t>Within the BRAIN Framework, BRS3 (Inflammation &amp; Oxidative Stress) describes the immune and redox regulation layer linking dietary pattern, gut–immune context, and antioxidant biology to inflammatory signalling and oxidative burden. Three Functional Mechanisms integrate eight Primary Mechanisms: BRS3(FM1) Anti-Inflammatory Signalling Tone (PM1–PM2: NF-κB regulation, gut-derived inflammatory signalling); BRS3(FM2) Antioxidant Defense Capacity (PM3–PM6: Nrf2-ARE antioxidant activation, ROS generation versus clearance balance, lipid peroxidation control, antioxidant network recycling); and BRS3(FM3) Inflammation Resolution Capacity (PM7–PM8: cytokine network modulation, eicosanoid/SPM balance). Key Constraints govern shared antioxidant substrate and essential fatty-acid pools that constrain multiple PMs simultaneously.</w:t>
+        <w:t>Within the BRAIN Framework, BRS3 (Inflammation &amp; Oxidative Stress) describes the immune and redox regulation layer linking dietary pattern, gut–immune context, and antioxidant biology to inflammatory signalling and oxidative burden. Three Functional Mechanisms integrate eight Primary Mechanisms: BRS3(FM1) Anti-Inflammatory Signalling Tone (PM1–PM2: NF-κB regulation, gut-derived inflammatory signalling); BRS3(FM2) Antioxidant Defense Capacity (PM3–PM6: Nrf2-ARE antioxidant activation, ROS generation versus clearance balance, lipid peroxidation control, antioxidant network recycling); and BRS3(FM3) Inflammation Resolution Capacity (PM7–PM8: cytokine network modulation, eicosanoid/SPM balance). Key Constraints are BRS3(KC1) Antioxidant Substrate Availability and BRS3(KC3) Essential Fatty Acid Balance — shared pools constraining endogenous antioxidant defence, redox buffering, inflammatory signalling, and inflammation-resolution pathways. BRS3 cross-links to BRS5 gut-barrier and immune-interface biology where gut-derived inflammatory load is relevant.</w:t>
       </w:r>
     </w:p>
     <w:p>
@@ -540,7 +540,7 @@
           <w:rFonts w:ascii="Times New Roman" w:hAnsi="Times New Roman"/>
           <w:sz w:val="24"/>
         </w:rPr>
-        <w:t>In ADHD, inflammatory and redox biology intersect across these capacities rather than through a single biomarker. Systemic inflammation relates to default-mode network connectivity (Marsland et al., 2017); metabolic and postprandial inflammatory patterns are reported (Brown et al., 2025); and elevated pro-inflammatory cytokine context is described in paediatric cohorts (Chang et al., 2020). Gut-derived load includes reduced microbiome alpha diversity (Prehn-Kristensen et al., 2018), butyrate-linked neuroinflammation framing (Yunting Li et al., 2024), and propionate–norepinephrine signalling with possible attention relevance (Hoyles et al., 2018). Immune–allergy overlap is also reported (Wesselink et al., 2019). On the redox side, adult ADHD cohorts show elevated malondialdehyde (Bulut et al., 2007), thiol/disulfide shifts and DNA oxidation markers (Kurhan &amp; Alp, 2021), elevated oxidative-stress indices (Miniksar et al., 2023), and compensatory glutathione elevation (Verlaet et al., 2019). Dietary antioxidant treatment rationale, ultra-processed food and metals exposure, and emerging contaminant burden are reviewed in ADHD nutritional contexts (Verlaet et al., 2018; Dufault et al., 2024; Zhang et al., 2025).</w:t>
+        <w:t>In ADHD, inflammatory and redox biology intersect across these capacities rather than through a single biomarker. Systemic inflammation relates to default-mode network connectivity (Marsland et al., 2017); metabolic and postprandial inflammatory patterns are reported (Brown et al., 2025); and elevated pro-inflammatory cytokine context is described in paediatric cohorts (Chang et al., 2020). Gut-derived load includes reduced microbiome alpha diversity (Prehn-Kristensen et al., 2018), butyrate-linked neuroinflammation framing (Yunting Li et al., 2024), and propionate–norepinephrine signalling with possible attention relevance (Hoyles et al., 2018). Immune–allergy overlap is also reported (Wesselink et al., 2019). On the redox side, adult ADHD cohorts show elevated malondialdehyde (Bulut et al., 2007), thiol/disulfide shifts and DNA oxidation markers (Kurhan &amp; Alp, 2021), elevated oxidative-stress indices (Miniksar et al., 2023), and compensatory glutathione elevation (Verlaet et al., 2019). Dietary antioxidant treatment rationale, ultra-processed food and metals exposure, and emerging contaminant burden are reviewed in ADHD nutritional contexts (Verlaet et al., 2018; Dufault et al., 2024; Zhang et al., 2025). A small randomised Pycnogenol trial reported attention and hyperactivity improvements with normalised total antioxidant status and glutathione balance, though replication remains limited (Trebatická et al., 2006; Dvořáková et al., 2006; Chovanová et al., 2006).</w:t>
       </w:r>
     </w:p>
     <w:p>
@@ -575,31 +575,7 @@
           <w:rFonts w:ascii="Times New Roman" w:hAnsi="Times New Roman"/>
           <w:sz w:val="24"/>
         </w:rPr>
-        <w:t>Verlaet et al. (2018) is a narrative review in Nutrients that argues for dietary antioxidant strategies as a complementary frame in ADHD, set against growing concern about limitations and side effects of stimulant pharmacotherapy alone. The authors synthesise evidence that ADHD is associated with immune dysregulation, epigenetic modulation of gene expression, and altered oxidant–antioxidant balance. Their central mechanistic claim is that chronic low-grade inflammation and oxidative stress can reinforce one another — through pathways such as T-cell-mediated neuroinflammation and neuronal oxidative injury — and that nutritional modulation of immune activity and redox state may therefore be biologically plausible in ADHD management. The review emphasises food-derived polyphenols and broader natural antioxidant strategies rather than high-dose isolated supplement megadosing.</w:t>
-      </w:r>
-    </w:p>
-    <w:p>
-      <w:pPr>
-        <w:spacing w:line="480" w:lineRule="auto" w:after="120"/>
-      </w:pPr>
-      <w:r>
-        <w:rPr>
-          <w:rFonts w:ascii="Times New Roman" w:hAnsi="Times New Roman"/>
-          <w:sz w:val="24"/>
-        </w:rPr>
-        <w:t>Within the BRAIN Framework, this paper is most directly anchored to BRS3-FM2-PM3 (Nrf2-ARE Antioxidant Activation), the PM governing endogenous antioxidant and detoxification gene programmes rather than passive dietary antioxidant intake alone. Verlaet et al. do not name Nrf2 explicitly, but their argument aligns with PM3 logic: raising cellular defence capacity through repeatable dietary induction patterns (for example crucifer-derived isothiocyanates such as sulforaphane) supported by trace-mineral cofactor sufficiency (selenium, zinc, manganese) within BRS3(KC1) Antioxidant Substrate Availability. Mechanistic support for Nrf2-linked induction in human dietary contexts is provided separately by Houghton et al. (2016), which PM3 cites for bioavailability and repeated-exposure kinetics; Mocchegiani &amp; Malavolta (2019) further supports cofactor dependence of endogenous antioxidant enzyme systems.</w:t>
-      </w:r>
-    </w:p>
-    <w:p>
-      <w:pPr>
-        <w:spacing w:line="480" w:lineRule="auto" w:after="120"/>
-      </w:pPr>
-      <w:r>
-        <w:rPr>
-          <w:rFonts w:ascii="Times New Roman" w:hAnsi="Times New Roman"/>
-          <w:sz w:val="24"/>
-        </w:rPr>
-        <w:t>For phenome interpretation, Verlaet et al. (2018) is used cautiously at low–medium confidence for Cognitive Clarity and Focus / Attention Stability on PM3 — as translational context linking oxidative-stress and immune readout shifts to attention-relevant biology, not as proof of dietary treatment efficacy. The paper is hypothesis-generating and integrative rather than an intervention outcome trial; findings should be read alongside sibling PMs handling net ROS balance (PM4), membrane lipid damage (PM5), and antioxidant network recycling (PM6). Its value for the manuscript is in justifying why BRS3(FM2) treats endogenous antioxidant activation as a first-class, diet-actionable mechanism in ADHD nutritional framing.</w:t>
+        <w:t>Verlaet et al. (2018) is a narrative review in Nutrients arguing that dietary antioxidant strategies may complement stimulant pharmacotherapy in ADHD, synthesising evidence linking ADHD to immune dysregulation, altered oxidant–antioxidant balance, and mutually reinforcing low-grade inflammation and oxidative stress. Within the BRAIN Framework, this argument aligns most directly with BRS3-FM2-PM3 (Nrf2-ARE Antioxidant Activation)—endogenous antioxidant and detoxification gene programmes induced through repeatable food-derived patterns rather than high-dose isolated supplement megadosing. The paper is used cautiously at low–medium confidence for Cognitive Clarity and Focus / Attention Stability as hypothesis-generating translational context, not proof of dietary treatment efficacy.</w:t>
       </w:r>
     </w:p>
     <w:p>
@@ -832,6 +808,48 @@
           <w:sz w:val="22"/>
         </w:rPr>
         <w:t>Zhang, Y., et al. (2025). Micro/nanoplastics and ADHD. See BRAIN Diet bibliography: zhang_exploring_2025.</w:t>
+      </w:r>
+    </w:p>
+    <w:p>
+      <w:pPr>
+        <w:pStyle w:val="ListNumber"/>
+        <w:spacing w:line="240" w:lineRule="auto" w:after="60"/>
+        <w:ind w:left="360" w:hanging="360"/>
+      </w:pPr>
+      <w:r>
+        <w:rPr>
+          <w:rFonts w:ascii="Times New Roman" w:hAnsi="Times New Roman"/>
+          <w:sz w:val="22"/>
+        </w:rPr>
+        <w:t>Trebatická, J., et al. (2006). Treatment of ADHD with French maritime pine bark extract, Pycnogenol. European Child &amp; Adolescent Psychiatry, 15(6), 329–335. https://doi.org/10.1007/s00787-006-0535-6</w:t>
+      </w:r>
+    </w:p>
+    <w:p>
+      <w:pPr>
+        <w:pStyle w:val="ListNumber"/>
+        <w:spacing w:line="240" w:lineRule="auto" w:after="60"/>
+        <w:ind w:left="360" w:hanging="360"/>
+      </w:pPr>
+      <w:r>
+        <w:rPr>
+          <w:rFonts w:ascii="Times New Roman" w:hAnsi="Times New Roman"/>
+          <w:sz w:val="22"/>
+        </w:rPr>
+        <w:t>Dvořáková, M., et al. (2006). Urinary catecholamines in children with ADHD before and after Pycnogenol treatment. See BRAIN Diet bibliography: dvorakova_glutathione_pycnogenol_adhd_2006.</w:t>
+      </w:r>
+    </w:p>
+    <w:p>
+      <w:pPr>
+        <w:pStyle w:val="ListNumber"/>
+        <w:spacing w:line="240" w:lineRule="auto" w:after="60"/>
+        <w:ind w:left="360" w:hanging="360"/>
+      </w:pPr>
+      <w:r>
+        <w:rPr>
+          <w:rFonts w:ascii="Times New Roman" w:hAnsi="Times New Roman"/>
+          <w:sz w:val="22"/>
+        </w:rPr>
+        <w:t>Chovanová, Z., et al. (2006). Effect of Pycnogenol on 8-oxoguanine in children with ADHD. See BRAIN Diet bibliography: chovanova_8oxoguanine_pycnogenol_adhd_2006.</w:t>
       </w:r>
     </w:p>
     <w:sectPr>

</xml_diff>